<commit_message>
worked on introduction section as well as results
</commit_message>
<xml_diff>
--- a/writing/Methods Section_Xenium_PQL_ZJP.docx
+++ b/writing/Methods Section_Xenium_PQL_ZJP.docx
@@ -224,7 +224,12 @@
         </w:rPr>
       </w:pPr>
       <w:r>
-        <w:rPr/>
+        <w:rPr>
+          <w:rFonts w:eastAsia="Arial" w:cs="Arial" w:ascii="Arial" w:hAnsi="Arial"/>
+          <w:color w:val="000000" w:themeColor="text1"/>
+          <w:sz w:val="22"/>
+          <w:szCs w:val="22"/>
+        </w:rPr>
       </w:r>
     </w:p>
     <w:p>
@@ -255,12 +260,7 @@
         <w:t xml:space="preserve">Data analysis was performed on Xenium samples from a total of 6 male mice (3 NSD, 3 SD), using the stock gene panel from 10x Genomics containing a total of 297 genes, which we represent as </w:t>
       </w:r>
       <w:r>
-        <w:rPr>
-          <w:rFonts w:eastAsia="Arial" w:cs="Arial" w:ascii="Arial" w:hAnsi="Arial"/>
-          <w:color w:val="000000" w:themeColor="text1"/>
-          <w:sz w:val="22"/>
-          <w:szCs w:val="22"/>
-        </w:rPr>
+        <w:rPr/>
       </w:r>
       <m:oMath xmlns:m="http://schemas.openxmlformats.org/officeDocument/2006/math">
         <m:sSub>
@@ -292,12 +292,7 @@
         <w:t xml:space="preserve">. The data for each sample was restricted to include only cells contained within the hippocampal formation, as seen in Fig. 1, giving a unique number of cells for each sample, identified as </w:t>
       </w:r>
       <w:r>
-        <w:rPr>
-          <w:rFonts w:eastAsia="Arial" w:cs="Arial" w:ascii="Arial" w:hAnsi="Arial"/>
-          <w:color w:val="000000" w:themeColor="text1"/>
-          <w:sz w:val="22"/>
-          <w:szCs w:val="22"/>
-        </w:rPr>
+        <w:rPr/>
       </w:r>
       <m:oMath xmlns:m="http://schemas.openxmlformats.org/officeDocument/2006/math">
         <m:sSub>
@@ -329,12 +324,7 @@
         <w:t xml:space="preserve">. The gene expression matrix for each mouse, with a size of </w:t>
       </w:r>
       <w:r>
-        <w:rPr>
-          <w:rFonts w:eastAsia="Arial" w:cs="Arial" w:ascii="Arial" w:hAnsi="Arial"/>
-          <w:color w:val="000000" w:themeColor="text1"/>
-          <w:sz w:val="22"/>
-          <w:szCs w:val="22"/>
-        </w:rPr>
+        <w:rPr/>
       </w:r>
       <m:oMath xmlns:m="http://schemas.openxmlformats.org/officeDocument/2006/math">
         <m:sSub>
@@ -394,7 +384,7 @@
       <w:pPr>
         <w:pStyle w:val="Normal"/>
         <w:spacing w:lineRule="auto" w:line="240"/>
-        <w:jc w:val="both"/>
+        <w:jc w:val="left"/>
         <w:rPr>
           <w:rFonts w:ascii="Arial" w:hAnsi="Arial" w:eastAsia="Arial" w:cs="Arial"/>
           <w:color w:val="000000" w:themeColor="text1"/>
@@ -403,12 +393,7 @@
         </w:rPr>
       </w:pPr>
       <w:r>
-        <w:rPr>
-          <w:rFonts w:eastAsia="Arial" w:cs="Arial" w:ascii="Arial" w:hAnsi="Arial"/>
-          <w:color w:val="000000" w:themeColor="text1"/>
-          <w:sz w:val="22"/>
-          <w:szCs w:val="22"/>
-        </w:rPr>
+        <w:rPr/>
       </w:r>
       <m:oMathPara xmlns:m="http://schemas.openxmlformats.org/officeDocument/2006/math">
         <m:oMathParaPr>
@@ -634,12 +619,7 @@
         <w:t xml:space="preserve">Where </w:t>
       </w:r>
       <w:r>
-        <w:rPr>
-          <w:rFonts w:eastAsia="Arial" w:cs="Arial" w:ascii="Arial" w:hAnsi="Arial"/>
-          <w:color w:val="000000" w:themeColor="text1"/>
-          <w:sz w:val="22"/>
-          <w:szCs w:val="22"/>
-        </w:rPr>
+        <w:rPr/>
       </w:r>
       <m:oMath xmlns:m="http://schemas.openxmlformats.org/officeDocument/2006/math">
         <m:sSub>
@@ -671,12 +651,7 @@
         <w:t xml:space="preserve"> and </w:t>
       </w:r>
       <w:r>
-        <w:rPr>
-          <w:rFonts w:eastAsia="Arial" w:cs="Arial" w:ascii="Arial" w:hAnsi="Arial"/>
-          <w:color w:val="000000" w:themeColor="text1"/>
-          <w:sz w:val="22"/>
-          <w:szCs w:val="22"/>
-        </w:rPr>
+        <w:rPr/>
       </w:r>
       <m:oMath xmlns:m="http://schemas.openxmlformats.org/officeDocument/2006/math">
         <m:sSub>
@@ -708,12 +683,7 @@
         <w:t xml:space="preserve"> are individual cells within the dataset. This calculation gave us a distance metric </w:t>
       </w:r>
       <w:r>
-        <w:rPr>
-          <w:rFonts w:eastAsia="Arial" w:cs="Arial" w:ascii="Arial" w:hAnsi="Arial"/>
-          <w:color w:val="000000" w:themeColor="text1"/>
-          <w:sz w:val="22"/>
-          <w:szCs w:val="22"/>
-        </w:rPr>
+        <w:rPr/>
       </w:r>
       <m:oMath xmlns:m="http://schemas.openxmlformats.org/officeDocument/2006/math">
         <m:sSub>
@@ -767,12 +737,7 @@
         <w:t xml:space="preserve">Spectral clustering was performed on each sample by first collecting each of these distances  </w:t>
       </w:r>
       <w:r>
-        <w:rPr>
-          <w:rFonts w:eastAsia="Arial" w:cs="Arial" w:ascii="Arial" w:hAnsi="Arial"/>
-          <w:color w:val="000000" w:themeColor="text1"/>
-          <w:sz w:val="22"/>
-          <w:szCs w:val="22"/>
-        </w:rPr>
+        <w:rPr/>
       </w:r>
       <m:oMath xmlns:m="http://schemas.openxmlformats.org/officeDocument/2006/math">
         <m:sSub>
@@ -804,12 +769,7 @@
         <w:t xml:space="preserve">into an </w:t>
       </w:r>
       <w:r>
-        <w:rPr>
-          <w:rFonts w:eastAsia="Arial" w:cs="Arial" w:ascii="Arial" w:hAnsi="Arial"/>
-          <w:color w:val="000000" w:themeColor="text1"/>
-          <w:sz w:val="22"/>
-          <w:szCs w:val="22"/>
-        </w:rPr>
+        <w:rPr/>
       </w:r>
       <m:oMath xmlns:m="http://schemas.openxmlformats.org/officeDocument/2006/math">
         <m:sSub>
@@ -865,12 +825,7 @@
         <w:t xml:space="preserve"> matrix called </w:t>
       </w:r>
       <w:r>
-        <w:rPr>
-          <w:rFonts w:eastAsia="Arial" w:cs="Arial" w:ascii="Arial" w:hAnsi="Arial"/>
-          <w:color w:val="000000" w:themeColor="text1"/>
-          <w:sz w:val="22"/>
-          <w:szCs w:val="22"/>
-        </w:rPr>
+        <w:rPr/>
       </w:r>
       <m:oMath xmlns:m="http://schemas.openxmlformats.org/officeDocument/2006/math">
         <m:r>
@@ -890,12 +845,7 @@
         <w:t xml:space="preserve"> for each sample that was then min-max normalized. The matrix  </w:t>
       </w:r>
       <w:r>
-        <w:rPr>
-          <w:rFonts w:eastAsia="Arial" w:cs="Arial" w:ascii="Arial" w:hAnsi="Arial"/>
-          <w:color w:val="000000" w:themeColor="text1"/>
-          <w:sz w:val="22"/>
-          <w:szCs w:val="22"/>
-        </w:rPr>
+        <w:rPr/>
       </w:r>
       <m:oMath xmlns:m="http://schemas.openxmlformats.org/officeDocument/2006/math">
         <m:r>
@@ -915,12 +865,7 @@
         <w:t xml:space="preserve"> was used as the adjacency matrix to calculate the graph Laplacian. The sum of all columns in </w:t>
       </w:r>
       <w:r>
-        <w:rPr>
-          <w:rFonts w:eastAsia="Arial" w:cs="Arial" w:ascii="Arial" w:hAnsi="Arial"/>
-          <w:color w:val="000000" w:themeColor="text1"/>
-          <w:sz w:val="22"/>
-          <w:szCs w:val="22"/>
-        </w:rPr>
+        <w:rPr/>
       </w:r>
       <m:oMath xmlns:m="http://schemas.openxmlformats.org/officeDocument/2006/math">
         <m:r>
@@ -937,33 +882,10 @@
           <w:sz w:val="22"/>
           <w:szCs w:val="22"/>
         </w:rPr>
-        <w:t xml:space="preserve"> w</w:t>
-      </w:r>
-      <w:r>
-        <w:rPr>
-          <w:rFonts w:eastAsia="Arial" w:cs="Arial" w:ascii="Arial" w:hAnsi="Arial"/>
-          <w:color w:val="000000" w:themeColor="text1"/>
-          <w:sz w:val="22"/>
-          <w:szCs w:val="22"/>
-        </w:rPr>
-        <w:t>ere</w:t>
-      </w:r>
-      <w:r>
-        <w:rPr>
-          <w:rFonts w:eastAsia="Arial" w:cs="Arial" w:ascii="Arial" w:hAnsi="Arial"/>
-          <w:color w:val="000000" w:themeColor="text1"/>
-          <w:sz w:val="22"/>
-          <w:szCs w:val="22"/>
-        </w:rPr>
-        <w:t xml:space="preserve"> next used to create a diagonal matrix </w:t>
-      </w:r>
-      <w:r>
-        <w:rPr>
-          <w:rFonts w:eastAsia="Arial" w:cs="Arial" w:ascii="Arial" w:hAnsi="Arial"/>
-          <w:color w:val="000000" w:themeColor="text1"/>
-          <w:sz w:val="22"/>
-          <w:szCs w:val="22"/>
-        </w:rPr>
+        <w:t xml:space="preserve"> were next used to create a diagonal matrix </w:t>
+      </w:r>
+      <w:r>
+        <w:rPr/>
       </w:r>
       <m:oMath xmlns:m="http://schemas.openxmlformats.org/officeDocument/2006/math">
         <m:r>
@@ -983,12 +905,7 @@
         <w:t xml:space="preserve">.The graph Laplacian was calculated for each sample by subtracting </w:t>
       </w:r>
       <w:r>
-        <w:rPr>
-          <w:rFonts w:eastAsia="Arial" w:cs="Arial" w:ascii="Arial" w:hAnsi="Arial"/>
-          <w:color w:val="000000" w:themeColor="text1"/>
-          <w:sz w:val="22"/>
-          <w:szCs w:val="22"/>
-        </w:rPr>
+        <w:rPr/>
       </w:r>
       <m:oMath xmlns:m="http://schemas.openxmlformats.org/officeDocument/2006/math">
         <m:r>
@@ -1008,12 +925,7 @@
         <w:t xml:space="preserve"> from </w:t>
       </w:r>
       <w:r>
-        <w:rPr>
-          <w:rFonts w:eastAsia="Arial" w:cs="Arial" w:ascii="Arial" w:hAnsi="Arial"/>
-          <w:color w:val="000000" w:themeColor="text1"/>
-          <w:sz w:val="22"/>
-          <w:szCs w:val="22"/>
-        </w:rPr>
+        <w:rPr/>
       </w:r>
       <m:oMath xmlns:m="http://schemas.openxmlformats.org/officeDocument/2006/math">
         <m:r>
@@ -1033,12 +945,7 @@
         <w:t xml:space="preserve">, giving the matrix </w:t>
       </w:r>
       <w:r>
-        <w:rPr>
-          <w:rFonts w:eastAsia="Arial" w:cs="Arial" w:ascii="Arial" w:hAnsi="Arial"/>
-          <w:color w:val="000000" w:themeColor="text1"/>
-          <w:sz w:val="22"/>
-          <w:szCs w:val="22"/>
-        </w:rPr>
+        <w:rPr/>
       </w:r>
       <m:oMath xmlns:m="http://schemas.openxmlformats.org/officeDocument/2006/math">
         <m:r>
@@ -1058,12 +965,7 @@
         <w:t xml:space="preserve">. For each sample, 250 eigenvectors and eigenvalues were calculated for </w:t>
       </w:r>
       <w:r>
-        <w:rPr>
-          <w:rFonts w:eastAsia="Arial" w:cs="Arial" w:ascii="Arial" w:hAnsi="Arial"/>
-          <w:color w:val="000000" w:themeColor="text1"/>
-          <w:sz w:val="22"/>
-          <w:szCs w:val="22"/>
-        </w:rPr>
+        <w:rPr/>
       </w:r>
       <m:oMath xmlns:m="http://schemas.openxmlformats.org/officeDocument/2006/math">
         <m:r>
@@ -1083,12 +985,7 @@
         <w:t xml:space="preserve"> and the sorted eigenvectors were used as input for a k-means clustering with </w:t>
       </w:r>
       <w:r>
-        <w:rPr>
-          <w:rFonts w:eastAsia="Arial" w:cs="Arial" w:ascii="Arial" w:hAnsi="Arial"/>
-          <w:color w:val="000000" w:themeColor="text1"/>
-          <w:sz w:val="22"/>
-          <w:szCs w:val="22"/>
-        </w:rPr>
+        <w:rPr/>
       </w:r>
       <m:oMath xmlns:m="http://schemas.openxmlformats.org/officeDocument/2006/math">
         <m:r>
@@ -1139,25 +1036,7 @@
           <w:sz w:val="22"/>
           <w:szCs w:val="22"/>
         </w:rPr>
-        <w:t xml:space="preserve">Following the clustering, samples were labeled using clusters based on either anatomical regions or cell type association. Each clustering for the individual samples was first visually inspected for anatomical alignment with the following hippocampal subregions: CA1, CA2, CA3, and DG. Additionally, each of the samples showed an additional cluster in the DG related to DG interneurons that was labeled as one of the cell type clusters. During the labeling of clusters, if two clusters showed the same region these were combined together into a single cluster. In the end, a total of 11 clusters were analyzed </w:t>
-      </w:r>
-      <w:r>
-        <w:rPr>
-          <w:rFonts w:eastAsia="Arial" w:cs="Arial" w:ascii="Arial" w:hAnsi="Arial"/>
-          <w:color w:val="000000" w:themeColor="text1"/>
-          <w:sz w:val="22"/>
-          <w:szCs w:val="22"/>
-        </w:rPr>
-        <w:t xml:space="preserve">from each sample, </w:t>
-      </w:r>
-      <w:r>
-        <w:rPr>
-          <w:rFonts w:eastAsia="Arial" w:cs="Arial" w:ascii="Arial" w:hAnsi="Arial"/>
-          <w:color w:val="000000" w:themeColor="text1"/>
-          <w:sz w:val="22"/>
-          <w:szCs w:val="22"/>
-        </w:rPr>
-        <w:t>representing 4 regions, 6 cell types, and 1 cluster for the remaining unlabeled cells.</w:t>
+        <w:t>Following the clustering, samples were labeled using clusters based on either anatomical regions or cell type association. Each clustering for the individual samples was first visually inspected for anatomical alignment with the following hippocampal subregions: CA1, CA2, CA3, and DG. Additionally, each of the samples showed an additional cluster in the DG related to DG interneurons that was labeled as one of the cell type clusters. During the labeling of clusters, if two clusters showed the same region these were combined together into a single cluster. In the end, a total of 11 clusters were analyzed from each sample, representing 4 regions, 6 cell types, and 1 cluster for the remaining unlabeled cells.</w:t>
       </w:r>
     </w:p>
     <w:p>
@@ -1173,7 +1052,12 @@
         </w:rPr>
       </w:pPr>
       <w:r>
-        <w:rPr/>
+        <w:rPr>
+          <w:rFonts w:eastAsia="Arial" w:cs="Arial" w:ascii="Arial" w:hAnsi="Arial"/>
+          <w:color w:val="000000" w:themeColor="text1"/>
+          <w:sz w:val="22"/>
+          <w:szCs w:val="22"/>
+        </w:rPr>
       </w:r>
     </w:p>
     <w:p>
@@ -1203,7 +1087,25 @@
           <w:i w:val="false"/>
           <w:iCs w:val="false"/>
         </w:rPr>
-        <w:t xml:space="preserve">In order to identify whether clusters were associated with a particular cell type, an analysis was performed to identify the predominant cell type in each of the remaining clusters that were not assigned to a hippocampal region. The cell types used in this analysis were: astrocytes, endothelial cells, microglia, oligodendrocytes, and neurons using gene lists from McKenzie et al. , as well as genes known to be identifiers for certain interneurons. The lists for each cell type in the original paper contain 1,000 genes per cell type. The genes contained in the Xenium dataset were then compared to these gene lists to identify potential marker genes within the data. All genes used are listed in Supp. Table X along with the corresponding cell type. In order to identify cell types, a z-scored gene matrix was first calculated for each hippocampal sample, normalizing each gene to a mean of zero. For each cell, the mean was calculated of all genes for a particular cell type and plotted as seen in Fig. 3. </w:t>
+        <w:t xml:space="preserve">In order to identify whether clusters were associated with a particular cell type, an analysis was performed to identify the predominant cell type in each of the remaining clusters that were not assigned to a hippocampal region. The cell types used in this analysis were: astrocytes, endothelial cells, microglia, oligodendrocytes, and neurons using gene lists from McKenzie et al. , as well as genes known to be identifiers for certain interneurons. The lists for each cell type in the original paper contain 1,000 genes per cell type. The genes contained in the Xenium dataset were then compared to these gene lists to identify potential marker genes within the data. All genes used are listed in Supp. Table X along with the corresponding cell type. </w:t>
+      </w:r>
+      <w:r>
+        <w:rPr>
+          <w:rStyle w:val="DefaultParagraphFont"/>
+          <w:rFonts w:ascii="Arial" w:hAnsi="Arial"/>
+          <w:i w:val="false"/>
+          <w:iCs w:val="false"/>
+        </w:rPr>
+        <w:t>Between 16 and 25 genes were used to identify each of the cell types astrocytes (20 genes), endothelial (25), microglia (16), and oligodendrocytes (16). For the interneuron cluster, five lists were curated with 4 to 8 genes each for five different types of interneurons. These included markers for Pvalb (6 genes), Sst (5), Vip (8), Sncg (4), and Lamp5 (7) interneurons.</w:t>
+      </w:r>
+      <w:r>
+        <w:rPr>
+          <w:rStyle w:val="DefaultParagraphFont"/>
+          <w:rFonts w:ascii="Arial" w:hAnsi="Arial"/>
+          <w:i w:val="false"/>
+          <w:iCs w:val="false"/>
+        </w:rPr>
+        <w:t xml:space="preserve"> In order to identify cell types, a z-scored gene matrix was first calculated for each hippocampal sample, normalizing each gene to a mean of zero. For each cell, the mean was calculated of all genes for a particular cell type and plotted as seen in Fig. 3. </w:t>
       </w:r>
     </w:p>
     <w:p>
@@ -1242,9 +1144,8 @@
       </w:pPr>
       <w:r>
         <w:rPr>
-          <w:rFonts w:ascii="Arial" w:hAnsi="Arial"/>
-          <w:i/>
-          <w:iCs/>
+          <w:i w:val="false"/>
+          <w:iCs w:val="false"/>
         </w:rPr>
       </w:r>
     </w:p>
@@ -1279,12 +1180,7 @@
         <w:t xml:space="preserve"> Using the above defined cluster labels, t-tests were performed on each region. This was done by combining all cells from a given cluster in a single sample into a vector with all cells from the same cluster in the remaining samples of the same condition and performing an t-test between the </w:t>
       </w:r>
       <w:r>
-        <w:rPr>
-          <w:rStyle w:val="DefaultParagraphFont"/>
-          <w:rFonts w:ascii="Arial" w:hAnsi="Arial"/>
-          <w:i w:val="false"/>
-          <w:iCs w:val="false"/>
-        </w:rPr>
+        <w:rPr/>
       </w:r>
       <m:oMath xmlns:m="http://schemas.openxmlformats.org/officeDocument/2006/math">
         <m:r>
@@ -2049,6 +1945,7 @@
     <w:rsid w:val="00b94886"/>
     <w:pPr>
       <w:widowControl/>
+      <w:suppressAutoHyphens w:val="true"/>
       <w:bidi w:val="0"/>
       <w:spacing w:lineRule="auto" w:line="276" w:before="0" w:after="160"/>
       <w:jc w:val="left"/>

</xml_diff>